<commit_message>
Update 2.4_GuiaEstudiante_Fase 2_DesarrolloProyecto APT.docx
</commit_message>
<xml_diff>
--- a/Fase 2/Evidencias Grupales/2.4_GuiaEstudiante_Fase 2_DesarrolloProyecto APT.docx
+++ b/Fase 2/Evidencias Grupales/2.4_GuiaEstudiante_Fase 2_DesarrolloProyecto APT.docx
@@ -631,22 +631,357 @@
               <w:jc w:val="both"/>
               <w:rPr>
                 <w:rFonts w:ascii="Calibri" w:hAnsi="Calibri" w:cs="Arial"/>
-                <w:i/>
-                <w:color w:val="548DD4"/>
-                <w:sz w:val="20"/>
-                <w:szCs w:val="20"/>
-                <w:lang w:eastAsia="es-CL"/>
-              </w:rPr>
-            </w:pPr>
-            <w:r>
-              <w:rPr>
-                <w:rFonts w:ascii="Calibri" w:hAnsi="Calibri" w:cs="Arial"/>
-                <w:i/>
-                <w:color w:val="548DD4"/>
-                <w:sz w:val="20"/>
-                <w:szCs w:val="20"/>
-                <w:lang w:eastAsia="es-CL"/>
-              </w:rPr>
+                <w:iCs/>
+                <w:sz w:val="20"/>
+                <w:szCs w:val="20"/>
+                <w:lang w:eastAsia="es-CL"/>
+              </w:rPr>
+            </w:pPr>
+            <w:r>
+              <w:rPr>
+                <w:rFonts w:ascii="Calibri" w:hAnsi="Calibri" w:cs="Arial"/>
+                <w:iCs/>
+                <w:sz w:val="20"/>
+                <w:szCs w:val="20"/>
+                <w:lang w:eastAsia="es-CL"/>
+              </w:rPr>
+              <w:t xml:space="preserve">Durante el desarrollo del proyecto </w:t>
+            </w:r>
+            <w:proofErr w:type="spellStart"/>
+            <w:r>
+              <w:rPr>
+                <w:rFonts w:ascii="Calibri" w:hAnsi="Calibri" w:cs="Arial"/>
+                <w:iCs/>
+                <w:sz w:val="20"/>
+                <w:szCs w:val="20"/>
+                <w:lang w:eastAsia="es-CL"/>
+              </w:rPr>
+              <w:t>ServiMatch</w:t>
+            </w:r>
+            <w:proofErr w:type="spellEnd"/>
+            <w:r>
+              <w:rPr>
+                <w:rFonts w:ascii="Calibri" w:hAnsi="Calibri" w:cs="Arial"/>
+                <w:iCs/>
+                <w:sz w:val="20"/>
+                <w:szCs w:val="20"/>
+                <w:lang w:eastAsia="es-CL"/>
+              </w:rPr>
+              <w:t xml:space="preserve"> se han realizado avances en las etapas de planificación, diseño y desarrollo de una aplicación móvil orientada a conectar clientes con trabajadores independientes que ofrecen distintos servicios.</w:t>
+            </w:r>
+          </w:p>
+          <w:p>
+            <w:pPr>
+              <w:jc w:val="both"/>
+              <w:rPr>
+                <w:rFonts w:ascii="Calibri" w:hAnsi="Calibri" w:cs="Arial"/>
+                <w:iCs/>
+                <w:sz w:val="20"/>
+                <w:szCs w:val="20"/>
+                <w:lang w:eastAsia="es-CL"/>
+              </w:rPr>
+            </w:pPr>
+            <w:r>
+              <w:rPr>
+                <w:rFonts w:ascii="Calibri" w:hAnsi="Calibri" w:cs="Arial"/>
+                <w:iCs/>
+                <w:sz w:val="20"/>
+                <w:szCs w:val="20"/>
+                <w:lang w:eastAsia="es-CL"/>
+              </w:rPr>
+              <w:t xml:space="preserve">En la etapa inicial se definieron los requerimientos funcionales, historias de usuario, épicas, casos de uso, arquitectura del sistema y modelo de datos. Además, se organizó el trabajo mediante un </w:t>
+            </w:r>
+            <w:proofErr w:type="spellStart"/>
+            <w:r>
+              <w:rPr>
+                <w:rFonts w:ascii="Calibri" w:hAnsi="Calibri" w:cs="Arial"/>
+                <w:iCs/>
+                <w:sz w:val="20"/>
+                <w:szCs w:val="20"/>
+                <w:lang w:eastAsia="es-CL"/>
+              </w:rPr>
+              <w:t>Product</w:t>
+            </w:r>
+            <w:proofErr w:type="spellEnd"/>
+            <w:r>
+              <w:rPr>
+                <w:rFonts w:ascii="Calibri" w:hAnsi="Calibri" w:cs="Arial"/>
+                <w:iCs/>
+                <w:sz w:val="20"/>
+                <w:szCs w:val="20"/>
+                <w:lang w:eastAsia="es-CL"/>
+              </w:rPr>
+              <w:t xml:space="preserve"> Backlog y la planificación de los </w:t>
+            </w:r>
+            <w:proofErr w:type="spellStart"/>
+            <w:r>
+              <w:rPr>
+                <w:rFonts w:ascii="Calibri" w:hAnsi="Calibri" w:cs="Arial"/>
+                <w:iCs/>
+                <w:sz w:val="20"/>
+                <w:szCs w:val="20"/>
+                <w:lang w:eastAsia="es-CL"/>
+              </w:rPr>
+              <w:t>sprints</w:t>
+            </w:r>
+            <w:proofErr w:type="spellEnd"/>
+            <w:r>
+              <w:rPr>
+                <w:rFonts w:ascii="Calibri" w:hAnsi="Calibri" w:cs="Arial"/>
+                <w:iCs/>
+                <w:sz w:val="20"/>
+                <w:szCs w:val="20"/>
+                <w:lang w:eastAsia="es-CL"/>
+              </w:rPr>
+              <w:t>.</w:t>
+            </w:r>
+          </w:p>
+          <w:p>
+            <w:pPr>
+              <w:jc w:val="both"/>
+              <w:rPr>
+                <w:rFonts w:ascii="Calibri" w:hAnsi="Calibri" w:cs="Arial"/>
+                <w:iCs/>
+                <w:sz w:val="20"/>
+                <w:szCs w:val="20"/>
+                <w:lang w:eastAsia="es-CL"/>
+              </w:rPr>
+            </w:pPr>
+            <w:r>
+              <w:rPr>
+                <w:rFonts w:ascii="Calibri" w:hAnsi="Calibri" w:cs="Arial"/>
+                <w:iCs/>
+                <w:sz w:val="20"/>
+                <w:szCs w:val="20"/>
+                <w:lang w:eastAsia="es-CL"/>
+              </w:rPr>
+              <w:t xml:space="preserve">Posteriormente, se realizó la preparación del entorno de desarrollo utilizando tecnologías como </w:t>
+            </w:r>
+            <w:proofErr w:type="spellStart"/>
+            <w:r>
+              <w:rPr>
+                <w:rFonts w:ascii="Calibri" w:hAnsi="Calibri" w:cs="Arial"/>
+                <w:iCs/>
+                <w:sz w:val="20"/>
+                <w:szCs w:val="20"/>
+                <w:lang w:eastAsia="es-CL"/>
+              </w:rPr>
+              <w:t>React</w:t>
+            </w:r>
+            <w:proofErr w:type="spellEnd"/>
+            <w:r>
+              <w:rPr>
+                <w:rFonts w:ascii="Calibri" w:hAnsi="Calibri" w:cs="Arial"/>
+                <w:iCs/>
+                <w:sz w:val="20"/>
+                <w:szCs w:val="20"/>
+                <w:lang w:eastAsia="es-CL"/>
+              </w:rPr>
+              <w:t xml:space="preserve"> Native con Expo, </w:t>
+            </w:r>
+            <w:proofErr w:type="spellStart"/>
+            <w:r>
+              <w:rPr>
+                <w:rFonts w:ascii="Calibri" w:hAnsi="Calibri" w:cs="Arial"/>
+                <w:iCs/>
+                <w:sz w:val="20"/>
+                <w:szCs w:val="20"/>
+                <w:lang w:eastAsia="es-CL"/>
+              </w:rPr>
+              <w:t>FastAPI</w:t>
+            </w:r>
+            <w:proofErr w:type="spellEnd"/>
+            <w:r>
+              <w:rPr>
+                <w:rFonts w:ascii="Calibri" w:hAnsi="Calibri" w:cs="Arial"/>
+                <w:iCs/>
+                <w:sz w:val="20"/>
+                <w:szCs w:val="20"/>
+                <w:lang w:eastAsia="es-CL"/>
+              </w:rPr>
+              <w:t xml:space="preserve">, PostgreSQL y </w:t>
+            </w:r>
+            <w:proofErr w:type="spellStart"/>
+            <w:r>
+              <w:rPr>
+                <w:rFonts w:ascii="Calibri" w:hAnsi="Calibri" w:cs="Arial"/>
+                <w:iCs/>
+                <w:sz w:val="20"/>
+                <w:szCs w:val="20"/>
+                <w:lang w:eastAsia="es-CL"/>
+              </w:rPr>
+              <w:t>Supabase</w:t>
+            </w:r>
+            <w:proofErr w:type="spellEnd"/>
+            <w:r>
+              <w:rPr>
+                <w:rFonts w:ascii="Calibri" w:hAnsi="Calibri" w:cs="Arial"/>
+                <w:iCs/>
+                <w:sz w:val="20"/>
+                <w:szCs w:val="20"/>
+                <w:lang w:eastAsia="es-CL"/>
+              </w:rPr>
+              <w:t xml:space="preserve">. Se avanzó en la estructura del </w:t>
+            </w:r>
+            <w:proofErr w:type="spellStart"/>
+            <w:r>
+              <w:rPr>
+                <w:rFonts w:ascii="Calibri" w:hAnsi="Calibri" w:cs="Arial"/>
+                <w:iCs/>
+                <w:sz w:val="20"/>
+                <w:szCs w:val="20"/>
+                <w:lang w:eastAsia="es-CL"/>
+              </w:rPr>
+              <w:t>backend</w:t>
+            </w:r>
+            <w:proofErr w:type="spellEnd"/>
+            <w:r>
+              <w:rPr>
+                <w:rFonts w:ascii="Calibri" w:hAnsi="Calibri" w:cs="Arial"/>
+                <w:iCs/>
+                <w:sz w:val="20"/>
+                <w:szCs w:val="20"/>
+                <w:lang w:eastAsia="es-CL"/>
+              </w:rPr>
+              <w:t>, la configuración de la base de datos y los mecanismos de autenticación de usuarios.</w:t>
+            </w:r>
+          </w:p>
+          <w:p>
+            <w:pPr>
+              <w:jc w:val="both"/>
+              <w:rPr>
+                <w:rFonts w:ascii="Calibri" w:hAnsi="Calibri" w:cs="Arial"/>
+                <w:iCs/>
+                <w:sz w:val="20"/>
+                <w:szCs w:val="20"/>
+                <w:lang w:eastAsia="es-CL"/>
+              </w:rPr>
+            </w:pPr>
+            <w:r>
+              <w:rPr>
+                <w:rFonts w:ascii="Calibri" w:hAnsi="Calibri" w:cs="Arial"/>
+                <w:iCs/>
+                <w:sz w:val="20"/>
+                <w:szCs w:val="20"/>
+                <w:lang w:eastAsia="es-CL"/>
+              </w:rPr>
+              <w:t xml:space="preserve">Actualmente, el equipo se encuentra en la etapa de desarrollo de la aplicación móvil, trabajando progresivamente en las funcionalidades principales de la plataforma y en la integración entre sus componentes. Durante este proceso se han identificado dificultades técnicas relacionadas con las pruebas funcionales y la integración con la base de datos, las cuales se han abordado mediante revisiones y ajustes durante los </w:t>
+            </w:r>
+            <w:proofErr w:type="spellStart"/>
+            <w:r>
+              <w:rPr>
+                <w:rFonts w:ascii="Calibri" w:hAnsi="Calibri" w:cs="Arial"/>
+                <w:iCs/>
+                <w:sz w:val="20"/>
+                <w:szCs w:val="20"/>
+                <w:lang w:eastAsia="es-CL"/>
+              </w:rPr>
+              <w:t>sprints</w:t>
+            </w:r>
+            <w:proofErr w:type="spellEnd"/>
+            <w:r>
+              <w:rPr>
+                <w:rFonts w:ascii="Calibri" w:hAnsi="Calibri" w:cs="Arial"/>
+                <w:iCs/>
+                <w:sz w:val="20"/>
+                <w:szCs w:val="20"/>
+                <w:lang w:eastAsia="es-CL"/>
+              </w:rPr>
+              <w:t>.</w:t>
+            </w:r>
+          </w:p>
+          <w:p>
+            <w:pPr>
+              <w:jc w:val="both"/>
+              <w:rPr>
+                <w:rFonts w:ascii="Calibri" w:hAnsi="Calibri" w:cs="Arial"/>
+                <w:iCs/>
+                <w:sz w:val="20"/>
+                <w:szCs w:val="20"/>
+                <w:lang w:eastAsia="es-CL"/>
+              </w:rPr>
+            </w:pPr>
+            <w:r>
+              <w:rPr>
+                <w:rFonts w:ascii="Calibri" w:hAnsi="Calibri" w:cs="Arial"/>
+                <w:iCs/>
+                <w:sz w:val="20"/>
+                <w:szCs w:val="20"/>
+                <w:lang w:eastAsia="es-CL"/>
+              </w:rPr>
+              <w:t xml:space="preserve">Estos avances han permitido cumplir las actividades iniciales de análisis, diseño y preparación de la infraestructura, mientras continúa el desarrollo de las funcionalidades necesarias para completar el producto mínimo viable (MVP) de </w:t>
+            </w:r>
+            <w:proofErr w:type="spellStart"/>
+            <w:r>
+              <w:rPr>
+                <w:rFonts w:ascii="Calibri" w:hAnsi="Calibri" w:cs="Arial"/>
+                <w:iCs/>
+                <w:sz w:val="20"/>
+                <w:szCs w:val="20"/>
+                <w:lang w:eastAsia="es-CL"/>
+              </w:rPr>
+              <w:t>ServiMatch</w:t>
+            </w:r>
+            <w:proofErr w:type="spellEnd"/>
+            <w:r>
+              <w:rPr>
+                <w:rFonts w:ascii="Calibri" w:hAnsi="Calibri" w:cs="Arial"/>
+                <w:iCs/>
+                <w:sz w:val="20"/>
+                <w:szCs w:val="20"/>
+                <w:lang w:eastAsia="es-CL"/>
+              </w:rPr>
+              <w:t>.</w:t>
+            </w:r>
+          </w:p>
+          <w:p>
+            <w:pPr>
+              <w:jc w:val="both"/>
+              <w:rPr>
+                <w:rFonts w:ascii="Calibri" w:hAnsi="Calibri" w:cs="Arial"/>
+                <w:i/>
+                <w:color w:val="548DD4"/>
+                <w:sz w:val="20"/>
+                <w:szCs w:val="20"/>
+                <w:lang w:eastAsia="es-CL"/>
+              </w:rPr>
+            </w:pPr>
+          </w:p>
+          <w:p>
+            <w:pPr>
+              <w:jc w:val="both"/>
+              <w:rPr>
+                <w:rFonts w:ascii="Calibri" w:hAnsi="Calibri" w:cs="Arial"/>
+                <w:i/>
+                <w:color w:val="548DD4"/>
+                <w:sz w:val="20"/>
+                <w:szCs w:val="20"/>
+                <w:lang w:eastAsia="es-CL"/>
+              </w:rPr>
+            </w:pPr>
+          </w:p>
+          <w:p>
+            <w:pPr>
+              <w:jc w:val="both"/>
+              <w:rPr>
+                <w:rFonts w:ascii="Calibri" w:hAnsi="Calibri" w:cs="Arial"/>
+                <w:i/>
+                <w:color w:val="548DD4"/>
+                <w:sz w:val="20"/>
+                <w:szCs w:val="20"/>
+                <w:lang w:eastAsia="es-CL"/>
+              </w:rPr>
+            </w:pPr>
+            <w:r>
+              <w:rPr>
+                <w:rFonts w:ascii="Calibri" w:hAnsi="Calibri" w:cs="Arial"/>
+                <w:i/>
+                <w:color w:val="548DD4"/>
+                <w:sz w:val="20"/>
+                <w:szCs w:val="20"/>
+                <w:lang w:eastAsia="es-CL"/>
+              </w:rPr>
+              <w:lastRenderedPageBreak/>
               <w:t xml:space="preserve">En esta </w:t>
             </w:r>
             <w:r>
@@ -820,6 +1155,7 @@
                 <w:rFonts w:ascii="Calibri" w:hAnsi="Calibri"/>
                 <w:color w:val="1F3864" w:themeColor="accent1" w:themeShade="80"/>
               </w:rPr>
+              <w:lastRenderedPageBreak/>
               <w:t>Objetivos</w:t>
             </w:r>
           </w:p>
@@ -829,6 +1165,41 @@
             <w:tcW w:w="7111" w:type="dxa"/>
             <w:vAlign w:val="center"/>
           </w:tcPr>
+          <w:p>
+            <w:pPr>
+              <w:jc w:val="both"/>
+              <w:rPr>
+                <w:rFonts w:ascii="Calibri" w:hAnsi="Calibri" w:cs="Arial"/>
+                <w:iCs/>
+                <w:sz w:val="20"/>
+                <w:szCs w:val="20"/>
+                <w:lang w:eastAsia="es-CL"/>
+              </w:rPr>
+            </w:pPr>
+            <w:r>
+              <w:rPr>
+                <w:rFonts w:ascii="Calibri" w:hAnsi="Calibri" w:cs="Arial"/>
+                <w:iCs/>
+                <w:sz w:val="20"/>
+                <w:szCs w:val="20"/>
+                <w:lang w:eastAsia="es-CL"/>
+              </w:rPr>
+              <w:t>Se mantienen los objetivos establecidos en la Fase 1 del proyecto APT. Durante el desarrollo se ha priorizado la implementación progresiva de las funcionalidades principales del MVP, sin modificar el propósito general de ServiMatch.</w:t>
+            </w:r>
+          </w:p>
+          <w:p>
+            <w:pPr>
+              <w:jc w:val="both"/>
+              <w:rPr>
+                <w:rFonts w:ascii="Calibri" w:hAnsi="Calibri" w:cs="Arial"/>
+                <w:i/>
+                <w:color w:val="548DD4"/>
+                <w:sz w:val="20"/>
+                <w:szCs w:val="20"/>
+                <w:lang w:eastAsia="es-CL"/>
+              </w:rPr>
+            </w:pPr>
+          </w:p>
           <w:p>
             <w:pPr>
               <w:jc w:val="both"/>
@@ -892,6 +1263,63 @@
               <w:rPr>
                 <w:rFonts w:ascii="Calibri" w:hAnsi="Calibri" w:cs="Arial"/>
                 <w:i/>
+                <w:sz w:val="20"/>
+                <w:szCs w:val="20"/>
+                <w:lang w:eastAsia="es-CL"/>
+              </w:rPr>
+            </w:pPr>
+            <w:r>
+              <w:rPr>
+                <w:rFonts w:ascii="Calibri" w:hAnsi="Calibri" w:cs="Arial"/>
+                <w:i/>
+                <w:sz w:val="20"/>
+                <w:szCs w:val="20"/>
+                <w:lang w:eastAsia="es-CL"/>
+              </w:rPr>
+              <w:t xml:space="preserve">Se mantiene la metodología ágil Scrum definida durante la Fase 1. El desarrollo del proyecto continúa organizado mediante </w:t>
+            </w:r>
+            <w:proofErr w:type="spellStart"/>
+            <w:r>
+              <w:rPr>
+                <w:rFonts w:ascii="Calibri" w:hAnsi="Calibri" w:cs="Arial"/>
+                <w:i/>
+                <w:sz w:val="20"/>
+                <w:szCs w:val="20"/>
+                <w:lang w:eastAsia="es-CL"/>
+              </w:rPr>
+              <w:t>sprints</w:t>
+            </w:r>
+            <w:proofErr w:type="spellEnd"/>
+            <w:r>
+              <w:rPr>
+                <w:rFonts w:ascii="Calibri" w:hAnsi="Calibri" w:cs="Arial"/>
+                <w:i/>
+                <w:sz w:val="20"/>
+                <w:szCs w:val="20"/>
+                <w:lang w:eastAsia="es-CL"/>
+              </w:rPr>
+              <w:t>, utilizando Jira para la planificación y seguimiento de actividades, y GitHub para el control de versiones del código fuente. Esta metodología permite revisar periódicamente los avances, identificar dificultades y priorizar las funcionalidades pendientes del proyecto.</w:t>
+            </w:r>
+          </w:p>
+          <w:p>
+            <w:pPr>
+              <w:jc w:val="both"/>
+              <w:rPr>
+                <w:rFonts w:ascii="Calibri" w:hAnsi="Calibri" w:cs="Arial"/>
+                <w:i/>
+                <w:color w:val="548DD4"/>
+                <w:sz w:val="20"/>
+                <w:szCs w:val="20"/>
+                <w:lang w:eastAsia="es-CL"/>
+              </w:rPr>
+            </w:pPr>
+          </w:p>
+          <w:p>
+            <w:pPr>
+              <w:jc w:val="both"/>
+              <w:rPr>
+                <w:rFonts w:ascii="Calibri" w:hAnsi="Calibri" w:cs="Arial"/>
+                <w:i/>
                 <w:color w:val="548DD4"/>
                 <w:sz w:val="20"/>
                 <w:szCs w:val="20"/>
@@ -948,6 +1376,283 @@
               <w:rPr>
                 <w:rFonts w:ascii="Calibri" w:hAnsi="Calibri" w:cs="Arial"/>
                 <w:i/>
+                <w:sz w:val="20"/>
+                <w:szCs w:val="20"/>
+                <w:lang w:eastAsia="es-CL"/>
+              </w:rPr>
+            </w:pPr>
+            <w:r>
+              <w:rPr>
+                <w:rFonts w:ascii="Calibri" w:hAnsi="Calibri" w:cs="Arial"/>
+                <w:i/>
+                <w:sz w:val="20"/>
+                <w:szCs w:val="20"/>
+                <w:lang w:eastAsia="es-CL"/>
+              </w:rPr>
+              <w:t xml:space="preserve">Como evidencias del desarrollo del proyecto </w:t>
+            </w:r>
+            <w:proofErr w:type="spellStart"/>
+            <w:r>
+              <w:rPr>
+                <w:rFonts w:ascii="Calibri" w:hAnsi="Calibri" w:cs="Arial"/>
+                <w:i/>
+                <w:sz w:val="20"/>
+                <w:szCs w:val="20"/>
+                <w:lang w:eastAsia="es-CL"/>
+              </w:rPr>
+              <w:t>ServiMatch</w:t>
+            </w:r>
+            <w:proofErr w:type="spellEnd"/>
+            <w:r>
+              <w:rPr>
+                <w:rFonts w:ascii="Calibri" w:hAnsi="Calibri" w:cs="Arial"/>
+                <w:i/>
+                <w:sz w:val="20"/>
+                <w:szCs w:val="20"/>
+                <w:lang w:eastAsia="es-CL"/>
+              </w:rPr>
+              <w:t xml:space="preserve"> se presentan los documentos de análisis y diseño, incluyendo requerimientos funcionales, historias de usuario, épicas, diagramas UML, arquitectura del sistema y modelo de datos.</w:t>
+            </w:r>
+          </w:p>
+          <w:p>
+            <w:pPr>
+              <w:jc w:val="both"/>
+              <w:rPr>
+                <w:rFonts w:ascii="Calibri" w:hAnsi="Calibri" w:cs="Arial"/>
+                <w:i/>
+                <w:sz w:val="20"/>
+                <w:szCs w:val="20"/>
+                <w:lang w:eastAsia="es-CL"/>
+              </w:rPr>
+            </w:pPr>
+            <w:r>
+              <w:rPr>
+                <w:rFonts w:ascii="Calibri" w:hAnsi="Calibri" w:cs="Arial"/>
+                <w:i/>
+                <w:sz w:val="20"/>
+                <w:szCs w:val="20"/>
+                <w:lang w:eastAsia="es-CL"/>
+              </w:rPr>
+              <w:t xml:space="preserve">Además, se considera el repositorio del proyecto, que permite evidenciar la estructura del código fuente y los avances realizados en la aplicación móvil, el </w:t>
+            </w:r>
+            <w:proofErr w:type="spellStart"/>
+            <w:r>
+              <w:rPr>
+                <w:rFonts w:ascii="Calibri" w:hAnsi="Calibri" w:cs="Arial"/>
+                <w:i/>
+                <w:sz w:val="20"/>
+                <w:szCs w:val="20"/>
+                <w:lang w:eastAsia="es-CL"/>
+              </w:rPr>
+              <w:t>backend</w:t>
+            </w:r>
+            <w:proofErr w:type="spellEnd"/>
+            <w:r>
+              <w:rPr>
+                <w:rFonts w:ascii="Calibri" w:hAnsi="Calibri" w:cs="Arial"/>
+                <w:i/>
+                <w:sz w:val="20"/>
+                <w:szCs w:val="20"/>
+                <w:lang w:eastAsia="es-CL"/>
+              </w:rPr>
+              <w:t xml:space="preserve"> y la base de datos.</w:t>
+            </w:r>
+          </w:p>
+          <w:p>
+            <w:pPr>
+              <w:jc w:val="both"/>
+              <w:rPr>
+                <w:rFonts w:ascii="Calibri" w:hAnsi="Calibri" w:cs="Arial"/>
+                <w:i/>
+                <w:sz w:val="20"/>
+                <w:szCs w:val="20"/>
+                <w:lang w:eastAsia="es-CL"/>
+              </w:rPr>
+            </w:pPr>
+            <w:r>
+              <w:rPr>
+                <w:rFonts w:ascii="Calibri" w:hAnsi="Calibri" w:cs="Arial"/>
+                <w:i/>
+                <w:sz w:val="20"/>
+                <w:szCs w:val="20"/>
+                <w:lang w:eastAsia="es-CL"/>
+              </w:rPr>
+              <w:t xml:space="preserve">También se incluyen las actividades documentadas de los </w:t>
+            </w:r>
+            <w:proofErr w:type="spellStart"/>
+            <w:r>
+              <w:rPr>
+                <w:rFonts w:ascii="Calibri" w:hAnsi="Calibri" w:cs="Arial"/>
+                <w:i/>
+                <w:sz w:val="20"/>
+                <w:szCs w:val="20"/>
+                <w:lang w:eastAsia="es-CL"/>
+              </w:rPr>
+              <w:t>sprints</w:t>
+            </w:r>
+            <w:proofErr w:type="spellEnd"/>
+            <w:r>
+              <w:rPr>
+                <w:rFonts w:ascii="Calibri" w:hAnsi="Calibri" w:cs="Arial"/>
+                <w:i/>
+                <w:sz w:val="20"/>
+                <w:szCs w:val="20"/>
+                <w:lang w:eastAsia="es-CL"/>
+              </w:rPr>
+              <w:t>, junto con las evidencias de pruebas y capturas de pantalla disponibles, las cuales permiten demostrar el trabajo realizado e identificar funcionalidades que requieren mejoras.</w:t>
+            </w:r>
+          </w:p>
+          <w:p>
+            <w:pPr>
+              <w:jc w:val="both"/>
+              <w:rPr>
+                <w:rFonts w:ascii="Calibri" w:hAnsi="Calibri" w:cs="Arial"/>
+                <w:i/>
+                <w:sz w:val="20"/>
+                <w:szCs w:val="20"/>
+                <w:lang w:eastAsia="es-CL"/>
+              </w:rPr>
+            </w:pPr>
+            <w:r>
+              <w:rPr>
+                <w:rFonts w:ascii="Calibri" w:hAnsi="Calibri" w:cs="Arial"/>
+                <w:i/>
+                <w:sz w:val="20"/>
+                <w:szCs w:val="20"/>
+                <w:lang w:eastAsia="es-CL"/>
+              </w:rPr>
+              <w:t>Estas evidencias permiten comprobar la aplicación de conocimientos relacionados con desarrollo de software, gestión de proyectos, bases de datos y aseguramiento de calidad. Asimismo, respaldan el seguimiento del proyecto mediante la metodología Scrum y permiten evaluar el avance técnico alcanzado durante esta etapa.</w:t>
+            </w:r>
+          </w:p>
+          <w:p>
+            <w:pPr>
+              <w:jc w:val="both"/>
+              <w:rPr>
+                <w:rFonts w:ascii="Calibri" w:hAnsi="Calibri" w:cs="Arial"/>
+                <w:i/>
+                <w:sz w:val="20"/>
+                <w:szCs w:val="20"/>
+                <w:lang w:eastAsia="es-CL"/>
+              </w:rPr>
+            </w:pPr>
+          </w:p>
+          <w:p>
+            <w:pPr>
+              <w:jc w:val="both"/>
+              <w:rPr>
+                <w:rFonts w:ascii="Calibri" w:hAnsi="Calibri" w:cs="Arial"/>
+                <w:i/>
+                <w:sz w:val="20"/>
+                <w:szCs w:val="20"/>
+                <w:lang w:eastAsia="es-CL"/>
+              </w:rPr>
+            </w:pPr>
+            <w:r>
+              <w:rPr>
+                <w:rFonts w:ascii="Calibri" w:hAnsi="Calibri" w:cs="Arial"/>
+                <w:i/>
+                <w:sz w:val="20"/>
+                <w:szCs w:val="20"/>
+                <w:lang w:eastAsia="es-CL"/>
+              </w:rPr>
+              <w:t xml:space="preserve">La documentación y las evidencias mencionadas se encuentran disponibles en las carpetas correspondientes del </w:t>
+            </w:r>
+            <w:proofErr w:type="gramStart"/>
+            <w:r>
+              <w:rPr>
+                <w:rFonts w:ascii="Calibri" w:hAnsi="Calibri" w:cs="Arial"/>
+                <w:i/>
+                <w:sz w:val="20"/>
+                <w:szCs w:val="20"/>
+                <w:lang w:eastAsia="es-CL"/>
+              </w:rPr>
+              <w:t>proyecto</w:t>
+            </w:r>
+            <w:r>
+              <w:rPr>
+                <w:rFonts w:ascii="Calibri" w:hAnsi="Calibri" w:cs="Arial"/>
+                <w:i/>
+                <w:sz w:val="20"/>
+                <w:szCs w:val="20"/>
+                <w:lang w:eastAsia="es-CL"/>
+              </w:rPr>
+              <w:t>(</w:t>
+            </w:r>
+            <w:proofErr w:type="gramEnd"/>
+            <w:r>
+              <w:rPr>
+                <w:rFonts w:ascii="Calibri" w:hAnsi="Calibri" w:cs="Arial"/>
+                <w:i/>
+                <w:sz w:val="20"/>
+                <w:szCs w:val="20"/>
+                <w:lang w:eastAsia="es-CL"/>
+              </w:rPr>
+              <w:t>Fase 2)</w:t>
+            </w:r>
+            <w:r>
+              <w:rPr>
+                <w:rFonts w:ascii="Calibri" w:hAnsi="Calibri" w:cs="Arial"/>
+                <w:i/>
+                <w:sz w:val="20"/>
+                <w:szCs w:val="20"/>
+                <w:lang w:eastAsia="es-CL"/>
+              </w:rPr>
+              <w:t xml:space="preserve"> </w:t>
+            </w:r>
+            <w:proofErr w:type="spellStart"/>
+            <w:r>
+              <w:rPr>
+                <w:rFonts w:ascii="Calibri" w:hAnsi="Calibri" w:cs="Arial"/>
+                <w:i/>
+                <w:sz w:val="20"/>
+                <w:szCs w:val="20"/>
+                <w:lang w:eastAsia="es-CL"/>
+              </w:rPr>
+              <w:t>Se</w:t>
+            </w:r>
+            <w:proofErr w:type="spellEnd"/>
+            <w:r>
+              <w:rPr>
+                <w:rFonts w:ascii="Calibri" w:hAnsi="Calibri" w:cs="Arial"/>
+                <w:i/>
+                <w:sz w:val="20"/>
+                <w:szCs w:val="20"/>
+                <w:lang w:eastAsia="es-CL"/>
+              </w:rPr>
+              <w:t>rviMatch para su revisión y evaluación.</w:t>
+            </w:r>
+          </w:p>
+          <w:p>
+            <w:pPr>
+              <w:jc w:val="both"/>
+              <w:rPr>
+                <w:rFonts w:ascii="Calibri" w:hAnsi="Calibri" w:cs="Arial"/>
+                <w:i/>
+                <w:sz w:val="20"/>
+                <w:szCs w:val="20"/>
+                <w:lang w:eastAsia="es-CL"/>
+              </w:rPr>
+            </w:pPr>
+          </w:p>
+          <w:p>
+            <w:pPr>
+              <w:jc w:val="both"/>
+              <w:rPr>
+                <w:rFonts w:ascii="Calibri" w:hAnsi="Calibri" w:cs="Arial"/>
+                <w:i/>
+                <w:color w:val="548DD4"/>
+                <w:sz w:val="20"/>
+                <w:szCs w:val="20"/>
+                <w:lang w:eastAsia="es-CL"/>
+              </w:rPr>
+            </w:pPr>
+          </w:p>
+          <w:p>
+            <w:pPr>
+              <w:jc w:val="both"/>
+              <w:rPr>
+                <w:rFonts w:ascii="Calibri" w:hAnsi="Calibri" w:cs="Arial"/>
+                <w:i/>
                 <w:color w:val="548DD4"/>
                 <w:sz w:val="20"/>
                 <w:szCs w:val="20"/>
@@ -1273,6 +1978,7 @@
                 <w:szCs w:val="20"/>
                 <w:lang w:eastAsia="es-CL"/>
               </w:rPr>
+              <w:lastRenderedPageBreak/>
               <w:t xml:space="preserve">En caso de ser pertinente </w:t>
             </w:r>
             <w:r>
@@ -1488,6 +2194,7 @@
                 <w:color w:val="1F3864" w:themeColor="accent1" w:themeShade="80"/>
                 <w:sz w:val="18"/>
               </w:rPr>
+              <w:lastRenderedPageBreak/>
               <w:t>Plan de Trabajo</w:t>
             </w:r>
           </w:p>
@@ -2898,59 +3605,238 @@
               <w:jc w:val="both"/>
               <w:rPr>
                 <w:rFonts w:ascii="Calibri" w:hAnsi="Calibri" w:cs="Arial"/>
-                <w:i/>
+                <w:color w:val="548DD4"/>
+                <w:sz w:val="20"/>
+                <w:szCs w:val="20"/>
+                <w:lang w:eastAsia="es-CL"/>
+              </w:rPr>
+            </w:pPr>
+            <w:r>
+              <w:rPr>
+                <w:rFonts w:ascii="Calibri" w:hAnsi="Calibri"/>
+                <w:color w:val="1F3864" w:themeColor="accent1" w:themeShade="80"/>
+              </w:rPr>
+              <w:t>Factores que han f</w:t>
+            </w:r>
+            <w:r>
+              <w:rPr>
+                <w:rFonts w:ascii="Calibri" w:hAnsi="Calibri"/>
+                <w:color w:val="1F3864" w:themeColor="accent1" w:themeShade="80"/>
+              </w:rPr>
+              <w:t>acilita</w:t>
+            </w:r>
+            <w:r>
+              <w:rPr>
+                <w:rFonts w:ascii="Calibri" w:hAnsi="Calibri"/>
+                <w:color w:val="1F3864" w:themeColor="accent1" w:themeShade="80"/>
+              </w:rPr>
+              <w:t>do y/o</w:t>
+            </w:r>
+            <w:r>
+              <w:rPr>
+                <w:rFonts w:ascii="Calibri" w:hAnsi="Calibri"/>
+                <w:color w:val="1F3864" w:themeColor="accent1" w:themeShade="80"/>
+              </w:rPr>
+              <w:t xml:space="preserve"> </w:t>
+            </w:r>
+            <w:r>
+              <w:rPr>
+                <w:rFonts w:ascii="Calibri" w:hAnsi="Calibri"/>
+                <w:color w:val="1F3864" w:themeColor="accent1" w:themeShade="80"/>
+              </w:rPr>
+              <w:t>dificultado el desarrollo de mi plan de trabajo</w:t>
+            </w:r>
+            <w:r>
+              <w:rPr>
+                <w:rFonts w:ascii="Calibri" w:hAnsi="Calibri" w:cs="Arial"/>
+                <w:color w:val="548DD4"/>
+                <w:sz w:val="20"/>
+                <w:szCs w:val="20"/>
+                <w:lang w:eastAsia="es-CL"/>
+              </w:rPr>
+              <w:t xml:space="preserve">: </w:t>
+            </w:r>
+          </w:p>
+          <w:p>
+            <w:pPr>
+              <w:jc w:val="both"/>
+              <w:rPr>
+                <w:rFonts w:ascii="Calibri" w:hAnsi="Calibri" w:cs="Arial"/>
                 <w:iCs/>
-                <w:color w:val="548DD4"/>
-                <w:sz w:val="20"/>
-                <w:szCs w:val="20"/>
-                <w:lang w:eastAsia="es-CL"/>
-              </w:rPr>
-            </w:pPr>
-            <w:r>
-              <w:rPr>
-                <w:rFonts w:ascii="Calibri" w:hAnsi="Calibri"/>
-                <w:color w:val="1F3864" w:themeColor="accent1" w:themeShade="80"/>
-              </w:rPr>
-              <w:t>Factores que han f</w:t>
-            </w:r>
-            <w:r>
-              <w:rPr>
-                <w:rFonts w:ascii="Calibri" w:hAnsi="Calibri"/>
-                <w:color w:val="1F3864" w:themeColor="accent1" w:themeShade="80"/>
-              </w:rPr>
-              <w:t>acilita</w:t>
-            </w:r>
-            <w:r>
-              <w:rPr>
-                <w:rFonts w:ascii="Calibri" w:hAnsi="Calibri"/>
-                <w:color w:val="1F3864" w:themeColor="accent1" w:themeShade="80"/>
-              </w:rPr>
-              <w:t>do y/o</w:t>
-            </w:r>
-            <w:r>
-              <w:rPr>
-                <w:rFonts w:ascii="Calibri" w:hAnsi="Calibri"/>
-                <w:color w:val="1F3864" w:themeColor="accent1" w:themeShade="80"/>
-              </w:rPr>
-              <w:t xml:space="preserve"> </w:t>
-            </w:r>
-            <w:r>
-              <w:rPr>
-                <w:rFonts w:ascii="Calibri" w:hAnsi="Calibri"/>
-                <w:color w:val="1F3864" w:themeColor="accent1" w:themeShade="80"/>
-              </w:rPr>
-              <w:t>dificultado el desarrollo de mi plan de trabajo</w:t>
-            </w:r>
-            <w:r>
-              <w:rPr>
-                <w:rFonts w:ascii="Calibri" w:hAnsi="Calibri" w:cs="Arial"/>
-                <w:color w:val="548DD4"/>
-                <w:sz w:val="20"/>
-                <w:szCs w:val="20"/>
-                <w:lang w:eastAsia="es-CL"/>
-              </w:rPr>
-              <w:t xml:space="preserve">: </w:t>
-            </w:r>
+                <w:sz w:val="20"/>
+                <w:szCs w:val="20"/>
+                <w:lang w:eastAsia="es-CL"/>
+              </w:rPr>
+            </w:pPr>
+            <w:r>
+              <w:rPr>
+                <w:rFonts w:ascii="Calibri" w:hAnsi="Calibri" w:cs="Arial"/>
+                <w:iCs/>
+                <w:sz w:val="20"/>
+                <w:szCs w:val="20"/>
+                <w:lang w:eastAsia="es-CL"/>
+              </w:rPr>
+              <w:t xml:space="preserve">Durante el desarrollo de </w:t>
+            </w:r>
+            <w:proofErr w:type="spellStart"/>
+            <w:r>
+              <w:rPr>
+                <w:rFonts w:ascii="Calibri" w:hAnsi="Calibri" w:cs="Arial"/>
+                <w:iCs/>
+                <w:sz w:val="20"/>
+                <w:szCs w:val="20"/>
+                <w:lang w:eastAsia="es-CL"/>
+              </w:rPr>
+              <w:t>ServiMatch</w:t>
+            </w:r>
+            <w:proofErr w:type="spellEnd"/>
+            <w:r>
+              <w:rPr>
+                <w:rFonts w:ascii="Calibri" w:hAnsi="Calibri" w:cs="Arial"/>
+                <w:iCs/>
+                <w:sz w:val="20"/>
+                <w:szCs w:val="20"/>
+                <w:lang w:eastAsia="es-CL"/>
+              </w:rPr>
+              <w:t xml:space="preserve">, uno de los principales factores que ha facilitado el avance del proyecto ha sido la organización del equipo mediante la metodología Scrum, permitiendo distribuir responsabilidades, planificar actividades y realizar seguimiento de las tareas a través de los </w:t>
+            </w:r>
+            <w:proofErr w:type="spellStart"/>
+            <w:r>
+              <w:rPr>
+                <w:rFonts w:ascii="Calibri" w:hAnsi="Calibri" w:cs="Arial"/>
+                <w:iCs/>
+                <w:sz w:val="20"/>
+                <w:szCs w:val="20"/>
+                <w:lang w:eastAsia="es-CL"/>
+              </w:rPr>
+              <w:t>sprints</w:t>
+            </w:r>
+            <w:proofErr w:type="spellEnd"/>
+            <w:r>
+              <w:rPr>
+                <w:rFonts w:ascii="Calibri" w:hAnsi="Calibri" w:cs="Arial"/>
+                <w:iCs/>
+                <w:sz w:val="20"/>
+                <w:szCs w:val="20"/>
+                <w:lang w:eastAsia="es-CL"/>
+              </w:rPr>
+              <w:t>.</w:t>
+            </w:r>
+          </w:p>
+          <w:p>
+            <w:pPr>
+              <w:jc w:val="both"/>
+              <w:rPr>
+                <w:rFonts w:ascii="Calibri" w:hAnsi="Calibri" w:cs="Arial"/>
+                <w:iCs/>
+                <w:sz w:val="20"/>
+                <w:szCs w:val="20"/>
+                <w:lang w:eastAsia="es-CL"/>
+              </w:rPr>
+            </w:pPr>
+            <w:r>
+              <w:rPr>
+                <w:rFonts w:ascii="Calibri" w:hAnsi="Calibri" w:cs="Arial"/>
+                <w:iCs/>
+                <w:sz w:val="20"/>
+                <w:szCs w:val="20"/>
+                <w:lang w:eastAsia="es-CL"/>
+              </w:rPr>
+              <w:t>Además, la utilización de herramientas como GitHub, Jira y Visual Studio Code ha contribuido a mantener un trabajo organizado y colaborativo.</w:t>
+            </w:r>
+          </w:p>
+          <w:p>
+            <w:pPr>
+              <w:jc w:val="both"/>
+              <w:rPr>
+                <w:rFonts w:ascii="Calibri" w:hAnsi="Calibri" w:cs="Arial"/>
+                <w:iCs/>
+                <w:sz w:val="20"/>
+                <w:szCs w:val="20"/>
+                <w:lang w:eastAsia="es-CL"/>
+              </w:rPr>
+            </w:pPr>
+            <w:r>
+              <w:rPr>
+                <w:rFonts w:ascii="Calibri" w:hAnsi="Calibri" w:cs="Arial"/>
+                <w:iCs/>
+                <w:sz w:val="20"/>
+                <w:szCs w:val="20"/>
+                <w:lang w:eastAsia="es-CL"/>
+              </w:rPr>
+              <w:t xml:space="preserve">Entre las principales dificultades se encuentran los problemas técnicos relacionados con la integración entre la aplicación móvil, el </w:t>
+            </w:r>
+            <w:proofErr w:type="spellStart"/>
+            <w:r>
+              <w:rPr>
+                <w:rFonts w:ascii="Calibri" w:hAnsi="Calibri" w:cs="Arial"/>
+                <w:iCs/>
+                <w:sz w:val="20"/>
+                <w:szCs w:val="20"/>
+                <w:lang w:eastAsia="es-CL"/>
+              </w:rPr>
+              <w:t>backend</w:t>
+            </w:r>
+            <w:proofErr w:type="spellEnd"/>
+            <w:r>
+              <w:rPr>
+                <w:rFonts w:ascii="Calibri" w:hAnsi="Calibri" w:cs="Arial"/>
+                <w:iCs/>
+                <w:sz w:val="20"/>
+                <w:szCs w:val="20"/>
+                <w:lang w:eastAsia="es-CL"/>
+              </w:rPr>
+              <w:t xml:space="preserve"> y la base de datos, además de las dificultades presentadas durante las pruebas funcionales. Estas situaciones han requerido revisar componentes del sistema, identificar errores y realizar ajustes técnicos para continuar con el desarrollo.</w:t>
+            </w:r>
+          </w:p>
+          <w:p>
+            <w:pPr>
+              <w:jc w:val="both"/>
+              <w:rPr>
+                <w:rFonts w:ascii="Calibri" w:hAnsi="Calibri" w:cs="Arial"/>
+                <w:iCs/>
+                <w:sz w:val="20"/>
+                <w:szCs w:val="20"/>
+                <w:lang w:eastAsia="es-CL"/>
+              </w:rPr>
+            </w:pPr>
+            <w:r>
+              <w:rPr>
+                <w:rFonts w:ascii="Calibri" w:hAnsi="Calibri" w:cs="Arial"/>
+                <w:iCs/>
+                <w:sz w:val="20"/>
+                <w:szCs w:val="20"/>
+                <w:lang w:eastAsia="es-CL"/>
+              </w:rPr>
+              <w:t>Para abordar estas dificultades, el equipo ha priorizado las funcionalidades principales del proyecto, manteniendo el seguimiento de las tareas pendientes y realizando revisiones de los avances.</w:t>
+            </w:r>
+          </w:p>
+          <w:p>
+            <w:pPr>
+              <w:jc w:val="both"/>
+              <w:rPr>
+                <w:rFonts w:ascii="Calibri" w:hAnsi="Calibri" w:cs="Arial"/>
+                <w:iCs/>
+                <w:color w:val="548DD4"/>
+                <w:sz w:val="20"/>
+                <w:szCs w:val="20"/>
+                <w:lang w:eastAsia="es-CL"/>
+              </w:rPr>
+            </w:pPr>
+          </w:p>
+          <w:p>
+            <w:pPr>
+              <w:jc w:val="both"/>
+              <w:rPr>
+                <w:rFonts w:ascii="Calibri" w:hAnsi="Calibri" w:cs="Arial"/>
+                <w:i/>
+                <w:iCs/>
+                <w:color w:val="548DD4"/>
+                <w:sz w:val="20"/>
+                <w:szCs w:val="20"/>
+                <w:lang w:eastAsia="es-CL"/>
+              </w:rPr>
+            </w:pPr>
             <w:r>
               <w:rPr>
                 <w:rFonts w:ascii="Calibri" w:hAnsi="Calibri" w:cs="Arial"/>
@@ -3132,20 +4018,116 @@
             <w:pPr>
               <w:jc w:val="both"/>
               <w:rPr>
-                <w:rFonts w:ascii="Calibri" w:hAnsi="Calibri" w:cs="Arial"/>
-                <w:i/>
-                <w:color w:val="548DD4"/>
-                <w:sz w:val="20"/>
-                <w:szCs w:val="20"/>
-                <w:lang w:eastAsia="es-CL"/>
-              </w:rPr>
-            </w:pPr>
-            <w:r>
-              <w:rPr>
-                <w:rFonts w:ascii="Calibri" w:hAnsi="Calibri"/>
-                <w:color w:val="1F3864" w:themeColor="accent1" w:themeShade="80"/>
-              </w:rPr>
-              <w:t xml:space="preserve">Actividades ajustadas o eliminadas: </w:t>
+                <w:rFonts w:ascii="Calibri" w:hAnsi="Calibri"/>
+                <w:color w:val="1F3864" w:themeColor="accent1" w:themeShade="80"/>
+              </w:rPr>
+            </w:pPr>
+            <w:r>
+              <w:rPr>
+                <w:rFonts w:ascii="Calibri" w:hAnsi="Calibri"/>
+                <w:color w:val="1F3864" w:themeColor="accent1" w:themeShade="80"/>
+              </w:rPr>
+              <w:lastRenderedPageBreak/>
+              <w:t>Actividades ajustadas o eliminadas:</w:t>
+            </w:r>
+          </w:p>
+          <w:p>
+            <w:pPr>
+              <w:jc w:val="both"/>
+              <w:rPr>
+                <w:rFonts w:ascii="Calibri" w:hAnsi="Calibri"/>
+              </w:rPr>
+            </w:pPr>
+            <w:r>
+              <w:rPr>
+                <w:rFonts w:ascii="Calibri" w:hAnsi="Calibri"/>
+              </w:rPr>
+              <w:t>Durante el desarrollo del proyecto se han realizado ajustes en la planificación de algunas actividades, principalmente en el orden de implementación de las funcionalidades de la aplicación móvil.</w:t>
+            </w:r>
+          </w:p>
+          <w:p>
+            <w:pPr>
+              <w:jc w:val="both"/>
+              <w:rPr>
+                <w:rFonts w:ascii="Calibri" w:hAnsi="Calibri"/>
+              </w:rPr>
+            </w:pPr>
+            <w:r>
+              <w:rPr>
+                <w:rFonts w:ascii="Calibri" w:hAnsi="Calibri"/>
+              </w:rPr>
+              <w:t>Estos ajustes han permitido priorizar las funcionalidades esenciales del MVP, especialmente aquellas relacionadas con la gestión de usuarios, autenticación e integración de los componentes del sistema.</w:t>
+            </w:r>
+          </w:p>
+          <w:p>
+            <w:pPr>
+              <w:jc w:val="both"/>
+              <w:rPr>
+                <w:rFonts w:ascii="Calibri" w:hAnsi="Calibri"/>
+              </w:rPr>
+            </w:pPr>
+            <w:r>
+              <w:rPr>
+                <w:rFonts w:ascii="Calibri" w:hAnsi="Calibri"/>
+              </w:rPr>
+              <w:t>Asimismo, se han realizado modificaciones y actualizaciones en la documentación del proyecto para mantenerla alineada con las decisiones tomadas durante el desarrollo.</w:t>
+            </w:r>
+          </w:p>
+          <w:p>
+            <w:pPr>
+              <w:jc w:val="both"/>
+              <w:rPr>
+                <w:rFonts w:ascii="Calibri" w:hAnsi="Calibri"/>
+              </w:rPr>
+            </w:pPr>
+            <w:r>
+              <w:rPr>
+                <w:rFonts w:ascii="Calibri" w:hAnsi="Calibri"/>
+              </w:rPr>
+              <w:t xml:space="preserve">De acuerdo con la planificación revisada, no se han identificado actividades eliminadas formalmente del plan de trabajo, sino ajustes en las prioridades de desarrollo y en las tareas técnicas necesarias para avanzar con la implementación de </w:t>
+            </w:r>
+            <w:proofErr w:type="spellStart"/>
+            <w:r>
+              <w:rPr>
+                <w:rFonts w:ascii="Calibri" w:hAnsi="Calibri"/>
+              </w:rPr>
+              <w:t>ServiMatch</w:t>
+            </w:r>
+            <w:proofErr w:type="spellEnd"/>
+            <w:r>
+              <w:rPr>
+                <w:rFonts w:ascii="Calibri" w:hAnsi="Calibri"/>
+              </w:rPr>
+              <w:t>.</w:t>
+            </w:r>
+          </w:p>
+          <w:p>
+            <w:pPr>
+              <w:jc w:val="both"/>
+              <w:rPr>
+                <w:rFonts w:ascii="Calibri" w:hAnsi="Calibri"/>
+                <w:color w:val="1F3864" w:themeColor="accent1" w:themeShade="80"/>
+              </w:rPr>
+            </w:pPr>
+          </w:p>
+          <w:p>
+            <w:pPr>
+              <w:jc w:val="both"/>
+              <w:rPr>
+                <w:rFonts w:ascii="Calibri" w:hAnsi="Calibri" w:cs="Arial"/>
+                <w:i/>
+                <w:color w:val="548DD4"/>
+                <w:sz w:val="20"/>
+                <w:szCs w:val="20"/>
+                <w:lang w:eastAsia="es-CL"/>
+              </w:rPr>
+            </w:pPr>
+            <w:r>
+              <w:rPr>
+                <w:rFonts w:ascii="Calibri" w:hAnsi="Calibri"/>
+                <w:color w:val="1F3864" w:themeColor="accent1" w:themeShade="80"/>
+              </w:rPr>
+              <w:t xml:space="preserve"> </w:t>
             </w:r>
             <w:r>
               <w:rPr>
@@ -3414,22 +4396,127 @@
             <w:pPr>
               <w:jc w:val="both"/>
               <w:rPr>
-                <w:rFonts w:ascii="Calibri" w:hAnsi="Calibri" w:cs="Arial"/>
-                <w:i/>
-                <w:color w:val="548DD4"/>
-                <w:sz w:val="20"/>
-                <w:szCs w:val="20"/>
-                <w:lang w:eastAsia="es-CL"/>
-              </w:rPr>
-            </w:pPr>
-            <w:r>
-              <w:rPr>
-                <w:rFonts w:ascii="Calibri" w:hAnsi="Calibri"/>
-                <w:color w:val="1F3864" w:themeColor="accent1" w:themeShade="80"/>
-              </w:rPr>
-              <w:lastRenderedPageBreak/>
+                <w:rFonts w:ascii="Calibri" w:hAnsi="Calibri"/>
+                <w:color w:val="1F3864" w:themeColor="accent1" w:themeShade="80"/>
+              </w:rPr>
+            </w:pPr>
+            <w:r>
+              <w:rPr>
+                <w:rFonts w:ascii="Calibri" w:hAnsi="Calibri"/>
+                <w:color w:val="1F3864" w:themeColor="accent1" w:themeShade="80"/>
+              </w:rPr>
               <w:t>Actividades que no has iniciado o están retrasadas:</w:t>
             </w:r>
+          </w:p>
+          <w:p>
+            <w:pPr>
+              <w:jc w:val="both"/>
+              <w:rPr>
+                <w:rFonts w:ascii="Calibri" w:hAnsi="Calibri"/>
+                <w:color w:val="1F3864" w:themeColor="accent1" w:themeShade="80"/>
+              </w:rPr>
+            </w:pPr>
+          </w:p>
+          <w:p>
+            <w:pPr>
+              <w:jc w:val="both"/>
+              <w:rPr>
+                <w:rFonts w:ascii="Calibri" w:hAnsi="Calibri"/>
+              </w:rPr>
+            </w:pPr>
+            <w:r>
+              <w:rPr>
+                <w:rFonts w:ascii="Calibri" w:hAnsi="Calibri"/>
+              </w:rPr>
+              <w:t>Actualmente, algunas funcionalidades de la aplicación móvil continúan en desarrollo y requieren completar su implementación, integración y pruebas de funcionamiento.</w:t>
+            </w:r>
+          </w:p>
+          <w:p>
+            <w:pPr>
+              <w:jc w:val="both"/>
+              <w:rPr>
+                <w:rFonts w:ascii="Calibri" w:hAnsi="Calibri"/>
+              </w:rPr>
+            </w:pPr>
+            <w:r>
+              <w:rPr>
+                <w:rFonts w:ascii="Calibri" w:hAnsi="Calibri"/>
+              </w:rPr>
+              <w:t>Entre los factores que han dificultado el avance se encuentran los problemas técnicos de integración entre componentes y las dificultades identificadas durante las pruebas funcionales, lo que ha requerido dedicar tiempo adicional a la revisión y corrección de errores.</w:t>
+            </w:r>
+          </w:p>
+          <w:p>
+            <w:pPr>
+              <w:jc w:val="both"/>
+              <w:rPr>
+                <w:rFonts w:ascii="Calibri" w:hAnsi="Calibri"/>
+              </w:rPr>
+            </w:pPr>
+            <w:r>
+              <w:rPr>
+                <w:rFonts w:ascii="Calibri" w:hAnsi="Calibri"/>
+              </w:rPr>
+              <w:t>Por otra parte, las actividades correspondientes al cierre del proyecto, elaboración del informe final y demostración del sistema aún no se han iniciado, debido a que están contempladas para la etapa final de la planificación.</w:t>
+            </w:r>
+          </w:p>
+          <w:p>
+            <w:pPr>
+              <w:jc w:val="both"/>
+              <w:rPr>
+                <w:rFonts w:ascii="Calibri" w:hAnsi="Calibri"/>
+              </w:rPr>
+            </w:pPr>
+            <w:r>
+              <w:rPr>
+                <w:rFonts w:ascii="Calibri" w:hAnsi="Calibri"/>
+              </w:rPr>
+              <w:t xml:space="preserve">Para evitar que estas actividades afecten el cumplimiento de los objetivos del proyecto, se continuará priorizando el desarrollo de las funcionalidades principales, realizando pruebas progresivas y manteniendo el seguimiento de las tareas pendientes mediante los </w:t>
+            </w:r>
+            <w:proofErr w:type="spellStart"/>
+            <w:r>
+              <w:rPr>
+                <w:rFonts w:ascii="Calibri" w:hAnsi="Calibri"/>
+              </w:rPr>
+              <w:t>sprints</w:t>
+            </w:r>
+            <w:proofErr w:type="spellEnd"/>
+            <w:r>
+              <w:rPr>
+                <w:rFonts w:ascii="Calibri" w:hAnsi="Calibri"/>
+              </w:rPr>
+              <w:t>.</w:t>
+            </w:r>
+          </w:p>
+          <w:p>
+            <w:pPr>
+              <w:jc w:val="both"/>
+              <w:rPr>
+                <w:rFonts w:ascii="Calibri" w:hAnsi="Calibri"/>
+                <w:color w:val="1F3864" w:themeColor="accent1" w:themeShade="80"/>
+              </w:rPr>
+            </w:pPr>
+          </w:p>
+          <w:p>
+            <w:pPr>
+              <w:jc w:val="both"/>
+              <w:rPr>
+                <w:rFonts w:ascii="Calibri" w:hAnsi="Calibri"/>
+                <w:color w:val="1F3864" w:themeColor="accent1" w:themeShade="80"/>
+              </w:rPr>
+            </w:pPr>
+          </w:p>
+          <w:p>
+            <w:pPr>
+              <w:jc w:val="both"/>
+              <w:rPr>
+                <w:rFonts w:ascii="Calibri" w:hAnsi="Calibri" w:cs="Arial"/>
+                <w:i/>
+                <w:color w:val="548DD4"/>
+                <w:sz w:val="20"/>
+                <w:szCs w:val="20"/>
+                <w:lang w:eastAsia="es-CL"/>
+              </w:rPr>
+            </w:pPr>
             <w:r>
               <w:rPr>
                 <w:rFonts w:ascii="Calibri" w:hAnsi="Calibri" w:cs="Arial"/>
@@ -5196,15 +6283,6 @@
 </file>
 
 <file path=customXml/item2.xml><?xml version="1.0" encoding="utf-8"?>
-<?mso-contentType ?>
-<FormTemplates xmlns="http://schemas.microsoft.com/sharepoint/v3/contenttype/forms">
-  <Display>DocumentLibraryForm</Display>
-  <Edit>DocumentLibraryForm</Edit>
-  <New>DocumentLibraryForm</New>
-</FormTemplates>
-</file>
-
-<file path=customXml/item3.xml><?xml version="1.0" encoding="utf-8"?>
 <ct:contentTypeSchema xmlns:ct="http://schemas.microsoft.com/office/2006/metadata/contentType" xmlns:ma="http://schemas.microsoft.com/office/2006/metadata/properties/metaAttributes" ct:_="" ma:_="" ma:contentTypeName="Documento" ma:contentTypeID="0x010100E96778489EE7714D8BD12CC105EB918B" ma:contentTypeVersion="2" ma:contentTypeDescription="Crear nuevo documento." ma:contentTypeScope="" ma:versionID="416c5c7ae9b5d54d83875cd3c65194e3">
   <xsd:schema xmlns:xsd="http://www.w3.org/2001/XMLSchema" xmlns:xs="http://www.w3.org/2001/XMLSchema" xmlns:p="http://schemas.microsoft.com/office/2006/metadata/properties" xmlns:ns2="126e8a1c-9ea9-435a-ac89-d06c80d62e30" targetNamespace="http://schemas.microsoft.com/office/2006/metadata/properties" ma:root="true" ma:fieldsID="70a237c842677bd850644f8595079f5e" ns2:_="">
     <xsd:import namespace="126e8a1c-9ea9-435a-ac89-d06c80d62e30"/>
@@ -5336,6 +6414,15 @@
 </ct:contentTypeSchema>
 </file>
 
+<file path=customXml/item3.xml><?xml version="1.0" encoding="utf-8"?>
+<?mso-contentType ?>
+<FormTemplates xmlns="http://schemas.microsoft.com/sharepoint/v3/contenttype/forms">
+  <Display>DocumentLibraryForm</Display>
+  <Edit>DocumentLibraryForm</Edit>
+  <New>DocumentLibraryForm</New>
+</FormTemplates>
+</file>
+
 <file path=customXml/itemProps1.xml><?xml version="1.0" encoding="utf-8"?>
 <ds:datastoreItem xmlns:ds="http://schemas.openxmlformats.org/officeDocument/2006/customXml" ds:itemID="{46CA5683-AF87-4E40-B841-2E23A3B52406}">
   <ds:schemaRefs>
@@ -5346,14 +6433,6 @@
 </file>
 
 <file path=customXml/itemProps2.xml><?xml version="1.0" encoding="utf-8"?>
-<ds:datastoreItem xmlns:ds="http://schemas.openxmlformats.org/officeDocument/2006/customXml" ds:itemID="{D51C61E4-DB75-4684-AD25-71F546404E96}">
-  <ds:schemaRefs>
-    <ds:schemaRef ds:uri="http://schemas.microsoft.com/sharepoint/v3/contenttype/forms"/>
-  </ds:schemaRefs>
-</ds:datastoreItem>
-</file>
-
-<file path=customXml/itemProps3.xml><?xml version="1.0" encoding="utf-8"?>
 <ds:datastoreItem xmlns:ds="http://schemas.openxmlformats.org/officeDocument/2006/customXml" ds:itemID="{6F3661B0-5934-4FAB-ADC6-33A19B814E8D}">
   <ds:schemaRefs>
     <ds:schemaRef ds:uri="http://schemas.microsoft.com/office/2006/metadata/contentType"/>
@@ -5369,4 +6448,12 @@
     <ds:schemaRef ds:uri="http://schemas.microsoft.com/internal/obd"/>
   </ds:schemaRefs>
 </ds:datastoreItem>
+</file>
+
+<file path=customXml/itemProps3.xml><?xml version="1.0" encoding="utf-8"?>
+<ds:datastoreItem xmlns:ds="http://schemas.openxmlformats.org/officeDocument/2006/customXml" ds:itemID="{D51C61E4-DB75-4684-AD25-71F546404E96}">
+  <ds:schemaRefs>
+    <ds:schemaRef ds:uri="http://schemas.microsoft.com/sharepoint/v3/contenttype/forms"/>
+  </ds:schemaRefs>
+</ds:datastoreItem>
 </file>
</xml_diff>